<commit_message>
Contact form & Dashboard implemented
</commit_message>
<xml_diff>
--- a/public/templates/Contrat d'engagement avec promoteur.docx
+++ b/public/templates/Contrat d'engagement avec promoteur.docx
@@ -5,604 +5,933 @@
     <w:p>
       <w:pPr>
         <w:pStyle w:val="Title"/>
+        <w:rPr>
+          <w:rFonts w:asciiTheme="majorBidi" w:hAnsiTheme="majorBidi"/>
+        </w:rPr>
       </w:pPr>
     </w:p>
     <w:p>
       <w:pPr>
         <w:pStyle w:val="Title"/>
         <w:jc w:val="center"/>
-      </w:pPr>
-      <w:r>
+        <w:rPr>
+          <w:rFonts w:asciiTheme="majorBidi" w:hAnsiTheme="majorBidi"/>
+          <w:sz w:val="48"/>
+          <w:szCs w:val="48"/>
+        </w:rPr>
+      </w:pPr>
+      <w:r>
+        <w:rPr>
+          <w:rFonts w:asciiTheme="majorBidi" w:hAnsiTheme="majorBidi"/>
+          <w:sz w:val="48"/>
+          <w:szCs w:val="48"/>
+        </w:rPr>
         <w:t>MANDAT DE COLLABORATION</w:t>
       </w:r>
       <w:r>
+        <w:rPr>
+          <w:rFonts w:asciiTheme="majorBidi" w:hAnsiTheme="majorBidi"/>
+          <w:sz w:val="48"/>
+          <w:szCs w:val="48"/>
+        </w:rPr>
         <w:t xml:space="preserve"> </w:t>
       </w:r>
       <w:r>
+        <w:rPr>
+          <w:rFonts w:asciiTheme="majorBidi" w:hAnsiTheme="majorBidi"/>
+          <w:sz w:val="48"/>
+          <w:szCs w:val="48"/>
+        </w:rPr>
         <w:t>AVEC UN PROMOTEUR IMMOBILIER</w:t>
       </w:r>
     </w:p>
     <w:p>
       <w:pPr>
         <w:spacing w:line="240" w:lineRule="auto"/>
-      </w:pPr>
-      <w:r>
+        <w:rPr>
+          <w:rFonts w:asciiTheme="majorBidi" w:hAnsiTheme="majorBidi" w:cstheme="majorBidi"/>
+          <w:sz w:val="24"/>
+          <w:szCs w:val="24"/>
+        </w:rPr>
+      </w:pPr>
+      <w:r>
+        <w:rPr>
+          <w:rFonts w:asciiTheme="majorBidi" w:hAnsiTheme="majorBidi" w:cstheme="majorBidi"/>
+          <w:sz w:val="24"/>
+          <w:szCs w:val="24"/>
+        </w:rPr>
         <w:t>Entre :</w:t>
       </w:r>
     </w:p>
     <w:p>
       <w:pPr>
         <w:spacing w:line="240" w:lineRule="auto"/>
-      </w:pPr>
-      <w:r>
+        <w:rPr>
+          <w:rFonts w:asciiTheme="majorBidi" w:hAnsiTheme="majorBidi" w:cstheme="majorBidi"/>
+          <w:sz w:val="24"/>
+          <w:szCs w:val="24"/>
+        </w:rPr>
+      </w:pPr>
+      <w:r>
+        <w:rPr>
+          <w:rFonts w:asciiTheme="majorBidi" w:hAnsiTheme="majorBidi" w:cstheme="majorBidi"/>
+          <w:sz w:val="24"/>
+          <w:szCs w:val="24"/>
+        </w:rPr>
         <w:t>Nom et prénom du gérant : {{AGENT_NAME}}</w:t>
       </w:r>
     </w:p>
     <w:p>
       <w:pPr>
         <w:spacing w:line="240" w:lineRule="auto"/>
-      </w:pPr>
-      <w:r>
+        <w:rPr>
+          <w:rFonts w:asciiTheme="majorBidi" w:hAnsiTheme="majorBidi" w:cstheme="majorBidi"/>
+          <w:sz w:val="24"/>
+          <w:szCs w:val="24"/>
+        </w:rPr>
+      </w:pPr>
+      <w:r>
+        <w:rPr>
+          <w:rFonts w:asciiTheme="majorBidi" w:hAnsiTheme="majorBidi" w:cstheme="majorBidi"/>
+          <w:sz w:val="24"/>
+          <w:szCs w:val="24"/>
+        </w:rPr>
         <w:t>Adresse de l’Agence : {{AGENCY_ADDRESS}}</w:t>
       </w:r>
     </w:p>
     <w:p>
       <w:pPr>
         <w:spacing w:line="240" w:lineRule="auto"/>
-      </w:pPr>
-      <w:r>
+        <w:rPr>
+          <w:rFonts w:asciiTheme="majorBidi" w:hAnsiTheme="majorBidi" w:cstheme="majorBidi"/>
+          <w:sz w:val="24"/>
+          <w:szCs w:val="24"/>
+        </w:rPr>
+      </w:pPr>
+      <w:r>
+        <w:rPr>
+          <w:rFonts w:asciiTheme="majorBidi" w:hAnsiTheme="majorBidi" w:cstheme="majorBidi"/>
+          <w:sz w:val="24"/>
+          <w:szCs w:val="24"/>
+        </w:rPr>
         <w:t>Téléphone : {{AGENCY_PHONE}}</w:t>
       </w:r>
     </w:p>
     <w:p>
       <w:pPr>
         <w:spacing w:line="240" w:lineRule="auto"/>
-      </w:pPr>
-      <w:r>
+        <w:rPr>
+          <w:rFonts w:asciiTheme="majorBidi" w:hAnsiTheme="majorBidi" w:cstheme="majorBidi"/>
+          <w:sz w:val="24"/>
+          <w:szCs w:val="24"/>
+        </w:rPr>
+      </w:pPr>
+      <w:r>
+        <w:rPr>
+          <w:rFonts w:asciiTheme="majorBidi" w:hAnsiTheme="majorBidi" w:cstheme="majorBidi"/>
+          <w:sz w:val="24"/>
+          <w:szCs w:val="24"/>
+        </w:rPr>
         <w:t>Email : {{AGENCY_EMAIL}}</w:t>
       </w:r>
     </w:p>
     <w:p>
       <w:pPr>
         <w:spacing w:line="240" w:lineRule="auto"/>
-      </w:pPr>
-    </w:p>
-    <w:p>
-      <w:pPr>
-        <w:spacing w:line="240" w:lineRule="auto"/>
-      </w:pPr>
-      <w:r>
+        <w:rPr>
+          <w:rFonts w:asciiTheme="majorBidi" w:hAnsiTheme="majorBidi" w:cstheme="majorBidi"/>
+          <w:sz w:val="24"/>
+          <w:szCs w:val="24"/>
+        </w:rPr>
+      </w:pPr>
+    </w:p>
+    <w:p>
+      <w:pPr>
+        <w:spacing w:line="240" w:lineRule="auto"/>
+        <w:rPr>
+          <w:rFonts w:asciiTheme="majorBidi" w:hAnsiTheme="majorBidi" w:cstheme="majorBidi"/>
+          <w:sz w:val="24"/>
+          <w:szCs w:val="24"/>
+        </w:rPr>
+      </w:pPr>
+      <w:r>
+        <w:rPr>
+          <w:rFonts w:asciiTheme="majorBidi" w:hAnsiTheme="majorBidi" w:cstheme="majorBidi"/>
+          <w:sz w:val="24"/>
+          <w:szCs w:val="24"/>
+        </w:rPr>
         <w:t>Et :</w:t>
       </w:r>
     </w:p>
     <w:p>
       <w:pPr>
         <w:spacing w:line="240" w:lineRule="auto"/>
-      </w:pPr>
-      <w:r>
+        <w:rPr>
+          <w:rFonts w:asciiTheme="majorBidi" w:hAnsiTheme="majorBidi" w:cstheme="majorBidi"/>
+          <w:sz w:val="24"/>
+          <w:szCs w:val="24"/>
+        </w:rPr>
+      </w:pPr>
+      <w:r>
+        <w:rPr>
+          <w:rFonts w:asciiTheme="majorBidi" w:hAnsiTheme="majorBidi" w:cstheme="majorBidi"/>
+          <w:sz w:val="24"/>
+          <w:szCs w:val="24"/>
+        </w:rPr>
         <w:t>Nom et prénom du Promoteur : {{PROMOTER_NAME}}</w:t>
       </w:r>
     </w:p>
     <w:p>
       <w:pPr>
         <w:spacing w:line="240" w:lineRule="auto"/>
-      </w:pPr>
-      <w:r>
+        <w:rPr>
+          <w:rFonts w:asciiTheme="majorBidi" w:hAnsiTheme="majorBidi" w:cstheme="majorBidi"/>
+          <w:sz w:val="24"/>
+          <w:szCs w:val="24"/>
+        </w:rPr>
+      </w:pPr>
+      <w:r>
+        <w:rPr>
+          <w:rFonts w:asciiTheme="majorBidi" w:hAnsiTheme="majorBidi" w:cstheme="majorBidi"/>
+          <w:sz w:val="24"/>
+          <w:szCs w:val="24"/>
+        </w:rPr>
         <w:t>Numéro CNI : {{PROMOTER_CNI}}</w:t>
       </w:r>
     </w:p>
     <w:p>
       <w:pPr>
         <w:spacing w:line="240" w:lineRule="auto"/>
-      </w:pPr>
-      <w:r>
+        <w:rPr>
+          <w:rFonts w:asciiTheme="majorBidi" w:hAnsiTheme="majorBidi" w:cstheme="majorBidi"/>
+          <w:sz w:val="24"/>
+          <w:szCs w:val="24"/>
+        </w:rPr>
+      </w:pPr>
+      <w:r>
+        <w:rPr>
+          <w:rFonts w:asciiTheme="majorBidi" w:hAnsiTheme="majorBidi" w:cstheme="majorBidi"/>
+          <w:sz w:val="24"/>
+          <w:szCs w:val="24"/>
+        </w:rPr>
         <w:t>Adresse : {{PROMOTER_ADDRESS}}</w:t>
       </w:r>
     </w:p>
     <w:p>
       <w:pPr>
         <w:spacing w:line="240" w:lineRule="auto"/>
-      </w:pPr>
-      <w:r>
+        <w:rPr>
+          <w:rFonts w:asciiTheme="majorBidi" w:hAnsiTheme="majorBidi" w:cstheme="majorBidi"/>
+          <w:sz w:val="24"/>
+          <w:szCs w:val="24"/>
+        </w:rPr>
+      </w:pPr>
+      <w:r>
+        <w:rPr>
+          <w:rFonts w:asciiTheme="majorBidi" w:hAnsiTheme="majorBidi" w:cstheme="majorBidi"/>
+          <w:sz w:val="24"/>
+          <w:szCs w:val="24"/>
+        </w:rPr>
         <w:t>Téléphone : {{PROMOTER_PHONE}}</w:t>
       </w:r>
     </w:p>
     <w:p>
       <w:pPr>
         <w:spacing w:line="240" w:lineRule="auto"/>
-      </w:pPr>
-    </w:p>
-    <w:p>
-      <w:pPr>
-        <w:spacing w:line="240" w:lineRule="auto"/>
-      </w:pPr>
-      <w:r>
+        <w:rPr>
+          <w:rFonts w:asciiTheme="majorBidi" w:hAnsiTheme="majorBidi" w:cstheme="majorBidi"/>
+          <w:sz w:val="24"/>
+          <w:szCs w:val="24"/>
+        </w:rPr>
+      </w:pPr>
+    </w:p>
+    <w:p>
+      <w:pPr>
+        <w:spacing w:line="240" w:lineRule="auto"/>
+        <w:rPr>
+          <w:rFonts w:asciiTheme="majorBidi" w:hAnsiTheme="majorBidi" w:cstheme="majorBidi"/>
+          <w:sz w:val="24"/>
+          <w:szCs w:val="24"/>
+        </w:rPr>
+      </w:pPr>
+      <w:r>
+        <w:rPr>
+          <w:rFonts w:asciiTheme="majorBidi" w:hAnsiTheme="majorBidi" w:cstheme="majorBidi"/>
+          <w:sz w:val="24"/>
+          <w:szCs w:val="24"/>
+        </w:rPr>
         <w:t>Objet du Contrat :</w:t>
       </w:r>
     </w:p>
     <w:p>
       <w:pPr>
         <w:spacing w:line="240" w:lineRule="auto"/>
-      </w:pPr>
-    </w:p>
-    <w:p>
-      <w:pPr>
-        <w:spacing w:line="240" w:lineRule="auto"/>
-      </w:pPr>
-      <w:r>
+        <w:rPr>
+          <w:rFonts w:asciiTheme="majorBidi" w:hAnsiTheme="majorBidi" w:cstheme="majorBidi"/>
+          <w:sz w:val="24"/>
+          <w:szCs w:val="24"/>
+        </w:rPr>
+      </w:pPr>
+    </w:p>
+    <w:p>
+      <w:pPr>
+        <w:spacing w:line="240" w:lineRule="auto"/>
+        <w:rPr>
+          <w:rFonts w:asciiTheme="majorBidi" w:hAnsiTheme="majorBidi" w:cstheme="majorBidi"/>
+          <w:sz w:val="24"/>
+          <w:szCs w:val="24"/>
+        </w:rPr>
+      </w:pPr>
+      <w:r>
+        <w:rPr>
+          <w:rFonts w:asciiTheme="majorBidi" w:hAnsiTheme="majorBidi" w:cstheme="majorBidi"/>
+          <w:sz w:val="24"/>
+          <w:szCs w:val="24"/>
+        </w:rPr>
         <w:t>Le présent mandat a pour objet d’établir une collaboration entre l’agence immobilière et le promoteur, afin d’assurer la commercialisation et la mise en valeur des projets immobiliers développés par le promoteur.</w:t>
       </w:r>
     </w:p>
     <w:p>
       <w:pPr>
         <w:spacing w:line="240" w:lineRule="auto"/>
-      </w:pPr>
-    </w:p>
-    <w:p>
-      <w:pPr>
-        <w:spacing w:line="240" w:lineRule="auto"/>
-      </w:pPr>
-      <w:r>
+        <w:rPr>
+          <w:rFonts w:asciiTheme="majorBidi" w:hAnsiTheme="majorBidi" w:cstheme="majorBidi"/>
+          <w:sz w:val="24"/>
+          <w:szCs w:val="24"/>
+        </w:rPr>
+      </w:pPr>
+      <w:r>
+        <w:rPr>
+          <w:rFonts w:asciiTheme="majorBidi" w:hAnsiTheme="majorBidi" w:cstheme="majorBidi"/>
+          <w:sz w:val="24"/>
+          <w:szCs w:val="24"/>
+        </w:rPr>
         <w:t>Responsabilités de l’Agence Immobilière :</w:t>
       </w:r>
     </w:p>
     <w:p>
       <w:pPr>
         <w:spacing w:line="240" w:lineRule="auto"/>
-      </w:pPr>
-    </w:p>
-    <w:p>
-      <w:pPr>
-        <w:spacing w:line="240" w:lineRule="auto"/>
-      </w:pPr>
-      <w:r>
+        <w:rPr>
+          <w:rFonts w:asciiTheme="majorBidi" w:hAnsiTheme="majorBidi" w:cstheme="majorBidi"/>
+          <w:sz w:val="24"/>
+          <w:szCs w:val="24"/>
+        </w:rPr>
+      </w:pPr>
+      <w:r>
+        <w:rPr>
+          <w:rFonts w:asciiTheme="majorBidi" w:hAnsiTheme="majorBidi" w:cstheme="majorBidi"/>
+          <w:sz w:val="24"/>
+          <w:szCs w:val="24"/>
+        </w:rPr>
         <w:t xml:space="preserve">• Promotion des projets  </w:t>
       </w:r>
     </w:p>
     <w:p>
       <w:pPr>
         <w:spacing w:line="240" w:lineRule="auto"/>
-      </w:pPr>
-      <w:r>
+        <w:rPr>
+          <w:rFonts w:asciiTheme="majorBidi" w:hAnsiTheme="majorBidi" w:cstheme="majorBidi"/>
+          <w:sz w:val="24"/>
+          <w:szCs w:val="24"/>
+        </w:rPr>
+      </w:pPr>
+      <w:r>
+        <w:rPr>
+          <w:rFonts w:asciiTheme="majorBidi" w:hAnsiTheme="majorBidi" w:cstheme="majorBidi"/>
+          <w:sz w:val="24"/>
+          <w:szCs w:val="24"/>
+        </w:rPr>
         <w:t>L’agence s’engage à promouvoir activement les programmes immobiliers du promoteur par tous moyens appropriés (publicité, prospection, visites, communication digitale, etc.).</w:t>
       </w:r>
     </w:p>
     <w:p>
       <w:pPr>
         <w:spacing w:line="240" w:lineRule="auto"/>
-      </w:pPr>
-    </w:p>
-    <w:p>
-      <w:pPr>
-        <w:spacing w:line="240" w:lineRule="auto"/>
-      </w:pPr>
-      <w:r>
+        <w:rPr>
+          <w:rFonts w:asciiTheme="majorBidi" w:hAnsiTheme="majorBidi" w:cstheme="majorBidi"/>
+          <w:sz w:val="24"/>
+          <w:szCs w:val="24"/>
+        </w:rPr>
+      </w:pPr>
+      <w:r>
+        <w:rPr>
+          <w:rFonts w:asciiTheme="majorBidi" w:hAnsiTheme="majorBidi" w:cstheme="majorBidi"/>
+          <w:sz w:val="24"/>
+          <w:szCs w:val="24"/>
+        </w:rPr>
         <w:t xml:space="preserve">• Information  </w:t>
       </w:r>
     </w:p>
     <w:p>
       <w:pPr>
         <w:spacing w:line="240" w:lineRule="auto"/>
-      </w:pPr>
-      <w:r>
+        <w:rPr>
+          <w:rFonts w:asciiTheme="majorBidi" w:hAnsiTheme="majorBidi" w:cstheme="majorBidi"/>
+          <w:sz w:val="24"/>
+          <w:szCs w:val="24"/>
+        </w:rPr>
+      </w:pPr>
+      <w:r>
+        <w:rPr>
+          <w:rFonts w:asciiTheme="majorBidi" w:hAnsiTheme="majorBidi" w:cstheme="majorBidi"/>
+          <w:sz w:val="24"/>
+          <w:szCs w:val="24"/>
+        </w:rPr>
         <w:t>L’agence tient régulièrement informé le promoteur de l’avancement des démarches, des retours clients et des propositions reçues.</w:t>
       </w:r>
     </w:p>
     <w:p>
       <w:pPr>
         <w:spacing w:line="240" w:lineRule="auto"/>
-      </w:pPr>
-    </w:p>
-    <w:p>
-      <w:pPr>
-        <w:spacing w:line="240" w:lineRule="auto"/>
-      </w:pPr>
-      <w:r>
+        <w:rPr>
+          <w:rFonts w:asciiTheme="majorBidi" w:hAnsiTheme="majorBidi" w:cstheme="majorBidi"/>
+          <w:sz w:val="24"/>
+          <w:szCs w:val="24"/>
+        </w:rPr>
+      </w:pPr>
+      <w:r>
+        <w:rPr>
+          <w:rFonts w:asciiTheme="majorBidi" w:hAnsiTheme="majorBidi" w:cstheme="majorBidi"/>
+          <w:sz w:val="24"/>
+          <w:szCs w:val="24"/>
+        </w:rPr>
         <w:t xml:space="preserve">• Négociation  </w:t>
       </w:r>
     </w:p>
     <w:p>
       <w:pPr>
         <w:spacing w:line="240" w:lineRule="auto"/>
-      </w:pPr>
-      <w:r>
-        <w:lastRenderedPageBreak/>
+        <w:rPr>
+          <w:rFonts w:asciiTheme="majorBidi" w:hAnsiTheme="majorBidi" w:cstheme="majorBidi"/>
+          <w:sz w:val="24"/>
+          <w:szCs w:val="24"/>
+        </w:rPr>
+      </w:pPr>
+      <w:r>
+        <w:rPr>
+          <w:rFonts w:asciiTheme="majorBidi" w:hAnsiTheme="majorBidi" w:cstheme="majorBidi"/>
+          <w:sz w:val="24"/>
+          <w:szCs w:val="24"/>
+        </w:rPr>
         <w:t>L’agence se charge de la négociation avec les acquéreurs potentiels et transmet au promoteur toutes les offres sérieuses.</w:t>
       </w:r>
     </w:p>
     <w:p>
       <w:pPr>
         <w:spacing w:line="240" w:lineRule="auto"/>
-      </w:pPr>
-    </w:p>
-    <w:p>
-      <w:pPr>
-        <w:spacing w:line="240" w:lineRule="auto"/>
-      </w:pPr>
-      <w:r>
+        <w:rPr>
+          <w:rFonts w:asciiTheme="majorBidi" w:hAnsiTheme="majorBidi" w:cstheme="majorBidi"/>
+          <w:sz w:val="24"/>
+          <w:szCs w:val="24"/>
+        </w:rPr>
+      </w:pPr>
+      <w:r>
+        <w:rPr>
+          <w:rFonts w:asciiTheme="majorBidi" w:hAnsiTheme="majorBidi" w:cstheme="majorBidi"/>
+          <w:sz w:val="24"/>
+          <w:szCs w:val="24"/>
+        </w:rPr>
         <w:t xml:space="preserve">• Assistance  </w:t>
       </w:r>
     </w:p>
     <w:p>
       <w:pPr>
         <w:spacing w:line="240" w:lineRule="auto"/>
-      </w:pPr>
-      <w:r>
+        <w:rPr>
+          <w:rFonts w:asciiTheme="majorBidi" w:hAnsiTheme="majorBidi" w:cstheme="majorBidi"/>
+          <w:sz w:val="24"/>
+          <w:szCs w:val="24"/>
+        </w:rPr>
+      </w:pPr>
+      <w:r>
+        <w:rPr>
+          <w:rFonts w:asciiTheme="majorBidi" w:hAnsiTheme="majorBidi" w:cstheme="majorBidi"/>
+          <w:sz w:val="24"/>
+          <w:szCs w:val="24"/>
+        </w:rPr>
         <w:t>L’agence accompagne le promoteur dans les démarches administratives et commerciales liées à la conclusion des ventes.</w:t>
       </w:r>
     </w:p>
     <w:p>
       <w:pPr>
         <w:spacing w:line="240" w:lineRule="auto"/>
-      </w:pPr>
-    </w:p>
-    <w:p>
-      <w:pPr>
-        <w:spacing w:line="240" w:lineRule="auto"/>
-      </w:pPr>
-    </w:p>
-    <w:p>
-      <w:pPr>
-        <w:spacing w:line="240" w:lineRule="auto"/>
-      </w:pPr>
-      <w:r>
+        <w:rPr>
+          <w:rFonts w:asciiTheme="majorBidi" w:hAnsiTheme="majorBidi" w:cstheme="majorBidi"/>
+          <w:sz w:val="24"/>
+          <w:szCs w:val="24"/>
+        </w:rPr>
+      </w:pPr>
+    </w:p>
+    <w:p>
+      <w:pPr>
+        <w:spacing w:line="240" w:lineRule="auto"/>
+        <w:rPr>
+          <w:rFonts w:asciiTheme="majorBidi" w:hAnsiTheme="majorBidi" w:cstheme="majorBidi"/>
+          <w:sz w:val="24"/>
+          <w:szCs w:val="24"/>
+        </w:rPr>
+      </w:pPr>
+    </w:p>
+    <w:p>
+      <w:pPr>
+        <w:spacing w:line="240" w:lineRule="auto"/>
+        <w:rPr>
+          <w:rFonts w:asciiTheme="majorBidi" w:hAnsiTheme="majorBidi" w:cstheme="majorBidi"/>
+          <w:sz w:val="24"/>
+          <w:szCs w:val="24"/>
+        </w:rPr>
+      </w:pPr>
+      <w:r>
+        <w:rPr>
+          <w:rFonts w:asciiTheme="majorBidi" w:hAnsiTheme="majorBidi" w:cstheme="majorBidi"/>
+          <w:sz w:val="24"/>
+          <w:szCs w:val="24"/>
+        </w:rPr>
         <w:t>Responsabilités du Promoteur :</w:t>
       </w:r>
     </w:p>
     <w:p>
       <w:pPr>
         <w:spacing w:line="240" w:lineRule="auto"/>
-      </w:pPr>
-    </w:p>
-    <w:p>
-      <w:pPr>
-        <w:spacing w:line="240" w:lineRule="auto"/>
-      </w:pPr>
-      <w:r>
+        <w:rPr>
+          <w:rFonts w:asciiTheme="majorBidi" w:hAnsiTheme="majorBidi" w:cstheme="majorBidi"/>
+          <w:sz w:val="24"/>
+          <w:szCs w:val="24"/>
+        </w:rPr>
+      </w:pPr>
+      <w:r>
+        <w:rPr>
+          <w:rFonts w:asciiTheme="majorBidi" w:hAnsiTheme="majorBidi" w:cstheme="majorBidi"/>
+          <w:sz w:val="24"/>
+          <w:szCs w:val="24"/>
+        </w:rPr>
         <w:t xml:space="preserve">• Disponibilité  </w:t>
       </w:r>
     </w:p>
     <w:p>
       <w:pPr>
         <w:spacing w:line="240" w:lineRule="auto"/>
-      </w:pPr>
-      <w:r>
+        <w:rPr>
+          <w:rFonts w:asciiTheme="majorBidi" w:hAnsiTheme="majorBidi" w:cstheme="majorBidi"/>
+          <w:sz w:val="24"/>
+          <w:szCs w:val="24"/>
+        </w:rPr>
+      </w:pPr>
+      <w:r>
+        <w:rPr>
+          <w:rFonts w:asciiTheme="majorBidi" w:hAnsiTheme="majorBidi" w:cstheme="majorBidi"/>
+          <w:sz w:val="24"/>
+          <w:szCs w:val="24"/>
+        </w:rPr>
         <w:t>Le promoteur doit fournir à l’agence toutes les informations et documents relatifs aux projets (plans, autorisations, descriptifs techniques, prix, etc.).</w:t>
       </w:r>
     </w:p>
     <w:p>
       <w:pPr>
         <w:spacing w:line="240" w:lineRule="auto"/>
-      </w:pPr>
-    </w:p>
-    <w:p>
-      <w:pPr>
-        <w:spacing w:line="240" w:lineRule="auto"/>
-      </w:pPr>
-      <w:r>
+        <w:rPr>
+          <w:rFonts w:asciiTheme="majorBidi" w:hAnsiTheme="majorBidi" w:cstheme="majorBidi"/>
+          <w:sz w:val="24"/>
+          <w:szCs w:val="24"/>
+        </w:rPr>
+      </w:pPr>
+      <w:r>
+        <w:rPr>
+          <w:rFonts w:asciiTheme="majorBidi" w:hAnsiTheme="majorBidi" w:cstheme="majorBidi"/>
+          <w:sz w:val="24"/>
+          <w:szCs w:val="24"/>
+        </w:rPr>
         <w:t xml:space="preserve">• Transparence  </w:t>
       </w:r>
     </w:p>
     <w:p>
       <w:pPr>
         <w:spacing w:line="240" w:lineRule="auto"/>
-      </w:pPr>
-      <w:r>
+        <w:rPr>
+          <w:rFonts w:asciiTheme="majorBidi" w:hAnsiTheme="majorBidi" w:cstheme="majorBidi"/>
+          <w:sz w:val="24"/>
+          <w:szCs w:val="24"/>
+        </w:rPr>
+      </w:pPr>
+      <w:r>
+        <w:rPr>
+          <w:rFonts w:asciiTheme="majorBidi" w:hAnsiTheme="majorBidi" w:cstheme="majorBidi"/>
+          <w:sz w:val="24"/>
+          <w:szCs w:val="24"/>
+        </w:rPr>
         <w:t>Le promoteur s’engage à communiquer à l’agence tout changement concernant le projet immobilier.</w:t>
       </w:r>
     </w:p>
     <w:p>
       <w:pPr>
         <w:spacing w:line="240" w:lineRule="auto"/>
-      </w:pPr>
-    </w:p>
-    <w:p>
-      <w:pPr>
-        <w:spacing w:line="240" w:lineRule="auto"/>
-      </w:pPr>
-      <w:r>
+        <w:rPr>
+          <w:rFonts w:asciiTheme="majorBidi" w:hAnsiTheme="majorBidi" w:cstheme="majorBidi"/>
+          <w:sz w:val="24"/>
+          <w:szCs w:val="24"/>
+        </w:rPr>
+      </w:pPr>
+      <w:r>
+        <w:rPr>
+          <w:rFonts w:asciiTheme="majorBidi" w:hAnsiTheme="majorBidi" w:cstheme="majorBidi"/>
+          <w:sz w:val="24"/>
+          <w:szCs w:val="24"/>
+        </w:rPr>
         <w:t xml:space="preserve">• Collaboration  </w:t>
       </w:r>
     </w:p>
     <w:p>
       <w:pPr>
         <w:spacing w:line="240" w:lineRule="auto"/>
-      </w:pPr>
-      <w:r>
+        <w:rPr>
+          <w:rFonts w:asciiTheme="majorBidi" w:hAnsiTheme="majorBidi" w:cstheme="majorBidi"/>
+          <w:sz w:val="24"/>
+          <w:szCs w:val="24"/>
+        </w:rPr>
+      </w:pPr>
+      <w:r>
+        <w:rPr>
+          <w:rFonts w:asciiTheme="majorBidi" w:hAnsiTheme="majorBidi" w:cstheme="majorBidi"/>
+          <w:sz w:val="24"/>
+          <w:szCs w:val="24"/>
+        </w:rPr>
         <w:t>Le promoteur doit coopérer activement dans les démarches commerciales et administratives.</w:t>
       </w:r>
     </w:p>
     <w:p>
       <w:pPr>
         <w:spacing w:line="240" w:lineRule="auto"/>
-      </w:pPr>
-    </w:p>
-    <w:p>
-      <w:pPr>
-        <w:spacing w:line="240" w:lineRule="auto"/>
-      </w:pPr>
-      <w:r>
+        <w:rPr>
+          <w:rFonts w:asciiTheme="majorBidi" w:hAnsiTheme="majorBidi" w:cstheme="majorBidi"/>
+          <w:sz w:val="24"/>
+          <w:szCs w:val="24"/>
+        </w:rPr>
+      </w:pPr>
+      <w:r>
+        <w:rPr>
+          <w:rFonts w:asciiTheme="majorBidi" w:hAnsiTheme="majorBidi" w:cstheme="majorBidi"/>
+          <w:sz w:val="24"/>
+          <w:szCs w:val="24"/>
+        </w:rPr>
         <w:t xml:space="preserve">• Exclusivité  </w:t>
       </w:r>
     </w:p>
     <w:p>
       <w:pPr>
         <w:spacing w:line="240" w:lineRule="auto"/>
-      </w:pPr>
-      <w:r>
+        <w:rPr>
+          <w:rFonts w:asciiTheme="majorBidi" w:hAnsiTheme="majorBidi" w:cstheme="majorBidi"/>
+          <w:sz w:val="24"/>
+          <w:szCs w:val="24"/>
+        </w:rPr>
+      </w:pPr>
+      <w:r>
+        <w:rPr>
+          <w:rFonts w:asciiTheme="majorBidi" w:hAnsiTheme="majorBidi" w:cstheme="majorBidi"/>
+          <w:sz w:val="24"/>
+          <w:szCs w:val="24"/>
+        </w:rPr>
         <w:t>Le promoteur s’engage à respecter l’exclusivité accordée à l’agence pendant la durée du contrat.</w:t>
       </w:r>
     </w:p>
     <w:p>
       <w:pPr>
         <w:spacing w:line="240" w:lineRule="auto"/>
-      </w:pPr>
-    </w:p>
-    <w:p>
-      <w:pPr>
-        <w:spacing w:line="240" w:lineRule="auto"/>
-      </w:pPr>
-    </w:p>
-    <w:p>
-      <w:pPr>
-        <w:spacing w:line="240" w:lineRule="auto"/>
-      </w:pPr>
-      <w:r>
+        <w:rPr>
+          <w:rFonts w:asciiTheme="majorBidi" w:hAnsiTheme="majorBidi" w:cstheme="majorBidi"/>
+          <w:sz w:val="24"/>
+          <w:szCs w:val="24"/>
+        </w:rPr>
+      </w:pPr>
+    </w:p>
+    <w:p>
+      <w:pPr>
+        <w:spacing w:line="240" w:lineRule="auto"/>
+        <w:rPr>
+          <w:rFonts w:asciiTheme="majorBidi" w:hAnsiTheme="majorBidi" w:cstheme="majorBidi"/>
+          <w:sz w:val="24"/>
+          <w:szCs w:val="24"/>
+        </w:rPr>
+      </w:pPr>
+      <w:r>
+        <w:rPr>
+          <w:rFonts w:asciiTheme="majorBidi" w:hAnsiTheme="majorBidi" w:cstheme="majorBidi"/>
+          <w:sz w:val="24"/>
+          <w:szCs w:val="24"/>
+        </w:rPr>
         <w:t>Durée du Contrat :</w:t>
       </w:r>
     </w:p>
     <w:p>
       <w:pPr>
         <w:spacing w:line="240" w:lineRule="auto"/>
-      </w:pPr>
-    </w:p>
-    <w:p>
-      <w:pPr>
-        <w:spacing w:line="240" w:lineRule="auto"/>
-      </w:pPr>
-      <w:r>
+        <w:rPr>
+          <w:rFonts w:asciiTheme="majorBidi" w:hAnsiTheme="majorBidi" w:cstheme="majorBidi"/>
+          <w:sz w:val="24"/>
+          <w:szCs w:val="24"/>
+        </w:rPr>
+      </w:pPr>
+      <w:r>
+        <w:rPr>
+          <w:rFonts w:asciiTheme="majorBidi" w:hAnsiTheme="majorBidi" w:cstheme="majorBidi"/>
+          <w:sz w:val="24"/>
+          <w:szCs w:val="24"/>
+        </w:rPr>
         <w:t>Le présent contrat prend effet à compter du {{START_DATE}} et reste en vigueur pour une durée de {{DURATION}}, sauf résiliation anticipée par l’une ou l’autre des parties moyennant un préavis écrit de {{NOTICE_PERIOD}}.</w:t>
       </w:r>
     </w:p>
     <w:p>
       <w:pPr>
         <w:spacing w:line="240" w:lineRule="auto"/>
-      </w:pPr>
-    </w:p>
-    <w:p>
-      <w:pPr>
-        <w:spacing w:line="240" w:lineRule="auto"/>
-      </w:pPr>
-    </w:p>
-    <w:p>
-      <w:pPr>
-        <w:spacing w:line="240" w:lineRule="auto"/>
-      </w:pPr>
-      <w:r>
+        <w:rPr>
+          <w:rFonts w:asciiTheme="majorBidi" w:hAnsiTheme="majorBidi" w:cstheme="majorBidi"/>
+          <w:sz w:val="24"/>
+          <w:szCs w:val="24"/>
+        </w:rPr>
+      </w:pPr>
+      <w:r>
+        <w:rPr>
+          <w:rFonts w:asciiTheme="majorBidi" w:hAnsiTheme="majorBidi" w:cstheme="majorBidi"/>
+          <w:sz w:val="24"/>
+          <w:szCs w:val="24"/>
+        </w:rPr>
         <w:t>Rémunération de l’Agence :</w:t>
       </w:r>
     </w:p>
     <w:p>
       <w:pPr>
         <w:spacing w:line="240" w:lineRule="auto"/>
-      </w:pPr>
-    </w:p>
-    <w:p>
-      <w:pPr>
-        <w:spacing w:line="240" w:lineRule="auto"/>
-      </w:pPr>
-      <w:r>
-        <w:lastRenderedPageBreak/>
+        <w:rPr>
+          <w:rFonts w:asciiTheme="majorBidi" w:hAnsiTheme="majorBidi" w:cstheme="majorBidi"/>
+          <w:sz w:val="24"/>
+          <w:szCs w:val="24"/>
+        </w:rPr>
+      </w:pPr>
+      <w:r>
+        <w:rPr>
+          <w:rFonts w:asciiTheme="majorBidi" w:hAnsiTheme="majorBidi" w:cstheme="majorBidi"/>
+          <w:sz w:val="24"/>
+          <w:szCs w:val="24"/>
+        </w:rPr>
         <w:t>En contrepartie de ses services, le promoteur s’engage à verser à l’agence une commission fixée à {{COMMISSION}} % du montant total des transactions réalisées, payable à la conclusion de chaque vente.</w:t>
       </w:r>
     </w:p>
     <w:p>
       <w:pPr>
         <w:spacing w:line="240" w:lineRule="auto"/>
-      </w:pPr>
-    </w:p>
-    <w:p>
-      <w:pPr>
-        <w:spacing w:line="240" w:lineRule="auto"/>
-      </w:pPr>
-    </w:p>
-    <w:p>
-      <w:pPr>
-        <w:spacing w:line="240" w:lineRule="auto"/>
-      </w:pPr>
-      <w:r>
+        <w:rPr>
+          <w:rFonts w:asciiTheme="majorBidi" w:hAnsiTheme="majorBidi" w:cstheme="majorBidi"/>
+          <w:sz w:val="24"/>
+          <w:szCs w:val="24"/>
+        </w:rPr>
+      </w:pPr>
+      <w:r>
+        <w:rPr>
+          <w:rFonts w:asciiTheme="majorBidi" w:hAnsiTheme="majorBidi" w:cstheme="majorBidi"/>
+          <w:sz w:val="24"/>
+          <w:szCs w:val="24"/>
+        </w:rPr>
         <w:t>Conditions Générales :</w:t>
       </w:r>
     </w:p>
     <w:p>
       <w:pPr>
         <w:spacing w:line="240" w:lineRule="auto"/>
-      </w:pPr>
-    </w:p>
-    <w:p>
-      <w:pPr>
-        <w:spacing w:line="240" w:lineRule="auto"/>
-      </w:pPr>
-      <w:r>
+        <w:rPr>
+          <w:rFonts w:asciiTheme="majorBidi" w:hAnsiTheme="majorBidi" w:cstheme="majorBidi"/>
+          <w:sz w:val="24"/>
+          <w:szCs w:val="24"/>
+        </w:rPr>
+      </w:pPr>
+      <w:r>
+        <w:rPr>
+          <w:rFonts w:asciiTheme="majorBidi" w:hAnsiTheme="majorBidi" w:cstheme="majorBidi"/>
+          <w:sz w:val="24"/>
+          <w:szCs w:val="24"/>
+        </w:rPr>
         <w:t xml:space="preserve">Le présent contrat constitue l’intégralité de l’accord entre les parties et remplace tout accord antérieur.  </w:t>
       </w:r>
     </w:p>
     <w:p>
       <w:pPr>
         <w:spacing w:line="240" w:lineRule="auto"/>
-      </w:pPr>
-      <w:r>
+        <w:rPr>
+          <w:rFonts w:asciiTheme="majorBidi" w:hAnsiTheme="majorBidi" w:cstheme="majorBidi"/>
+          <w:sz w:val="24"/>
+          <w:szCs w:val="24"/>
+        </w:rPr>
+      </w:pPr>
+      <w:r>
+        <w:rPr>
+          <w:rFonts w:asciiTheme="majorBidi" w:hAnsiTheme="majorBidi" w:cstheme="majorBidi"/>
+          <w:sz w:val="24"/>
+          <w:szCs w:val="24"/>
+        </w:rPr>
         <w:t>Aucune modification ne sera valable sans un écrit signé par les deux parties.</w:t>
       </w:r>
     </w:p>
     <w:p>
       <w:pPr>
         <w:spacing w:line="240" w:lineRule="auto"/>
-      </w:pPr>
-    </w:p>
-    <w:p>
-      <w:pPr>
-        <w:spacing w:line="240" w:lineRule="auto"/>
-      </w:pPr>
-    </w:p>
-    <w:p>
-      <w:pPr>
-        <w:spacing w:line="240" w:lineRule="auto"/>
+        <w:rPr>
+          <w:rFonts w:asciiTheme="majorBidi" w:hAnsiTheme="majorBidi" w:cstheme="majorBidi"/>
+          <w:sz w:val="24"/>
+          <w:szCs w:val="24"/>
+        </w:rPr>
       </w:pPr>
       <w:proofErr w:type="gramStart"/>
       <w:r>
+        <w:rPr>
+          <w:rFonts w:asciiTheme="majorBidi" w:hAnsiTheme="majorBidi" w:cstheme="majorBidi"/>
+          <w:sz w:val="24"/>
+          <w:szCs w:val="24"/>
+        </w:rPr>
         <w:t>Fait le</w:t>
       </w:r>
       <w:proofErr w:type="gramEnd"/>
       <w:r>
+        <w:rPr>
+          <w:rFonts w:asciiTheme="majorBidi" w:hAnsiTheme="majorBidi" w:cstheme="majorBidi"/>
+          <w:sz w:val="24"/>
+          <w:szCs w:val="24"/>
+        </w:rPr>
         <w:t xml:space="preserve"> : {{DATE}}</w:t>
       </w:r>
     </w:p>
     <w:p>
       <w:pPr>
         <w:spacing w:line="240" w:lineRule="auto"/>
-      </w:pPr>
-      <w:r>
+        <w:rPr>
+          <w:rFonts w:asciiTheme="majorBidi" w:hAnsiTheme="majorBidi" w:cstheme="majorBidi"/>
+          <w:sz w:val="24"/>
+          <w:szCs w:val="24"/>
+        </w:rPr>
+      </w:pPr>
+      <w:r>
+        <w:rPr>
+          <w:rFonts w:asciiTheme="majorBidi" w:hAnsiTheme="majorBidi" w:cstheme="majorBidi"/>
+          <w:sz w:val="24"/>
+          <w:szCs w:val="24"/>
+        </w:rPr>
         <w:t>À : {{CITY}}</w:t>
       </w:r>
     </w:p>
     <w:p>
       <w:pPr>
         <w:spacing w:line="240" w:lineRule="auto"/>
-      </w:pPr>
-    </w:p>
-    <w:p>
-      <w:pPr>
-        <w:spacing w:line="240" w:lineRule="auto"/>
-      </w:pPr>
-    </w:p>
-    <w:p>
-      <w:pPr>
-        <w:spacing w:line="240" w:lineRule="auto"/>
-      </w:pPr>
-      <w:r>
+        <w:rPr>
+          <w:rFonts w:asciiTheme="majorBidi" w:hAnsiTheme="majorBidi" w:cstheme="majorBidi"/>
+          <w:sz w:val="24"/>
+          <w:szCs w:val="24"/>
+        </w:rPr>
+      </w:pPr>
+      <w:r>
+        <w:rPr>
+          <w:rFonts w:asciiTheme="majorBidi" w:hAnsiTheme="majorBidi" w:cstheme="majorBidi"/>
+          <w:sz w:val="24"/>
+          <w:szCs w:val="24"/>
+        </w:rPr>
         <w:t>Signature du Gérant :</w:t>
       </w:r>
     </w:p>
     <w:p>
       <w:pPr>
         <w:spacing w:line="240" w:lineRule="auto"/>
-      </w:pPr>
-      <w:r>
+        <w:rPr>
+          <w:rFonts w:asciiTheme="majorBidi" w:hAnsiTheme="majorBidi" w:cstheme="majorBidi"/>
+          <w:sz w:val="24"/>
+          <w:szCs w:val="24"/>
+        </w:rPr>
+      </w:pPr>
+      <w:r>
+        <w:rPr>
+          <w:rFonts w:asciiTheme="majorBidi" w:hAnsiTheme="majorBidi" w:cstheme="majorBidi"/>
+          <w:sz w:val="24"/>
+          <w:szCs w:val="24"/>
+        </w:rPr>
         <w:t>{{AGENT_NAME}}</w:t>
       </w:r>
     </w:p>
     <w:p>
       <w:pPr>
         <w:spacing w:line="240" w:lineRule="auto"/>
-      </w:pPr>
-      <w:r>
+        <w:rPr>
+          <w:rFonts w:asciiTheme="majorBidi" w:hAnsiTheme="majorBidi" w:cstheme="majorBidi"/>
+          <w:sz w:val="24"/>
+          <w:szCs w:val="24"/>
+        </w:rPr>
+      </w:pPr>
+      <w:r>
+        <w:rPr>
+          <w:rFonts w:asciiTheme="majorBidi" w:hAnsiTheme="majorBidi" w:cstheme="majorBidi"/>
+          <w:sz w:val="24"/>
+          <w:szCs w:val="24"/>
+        </w:rPr>
         <w:t>___________________________</w:t>
       </w:r>
     </w:p>
     <w:p>
       <w:pPr>
         <w:spacing w:line="240" w:lineRule="auto"/>
-      </w:pPr>
-      <w:r>
+        <w:rPr>
+          <w:rFonts w:asciiTheme="majorBidi" w:hAnsiTheme="majorBidi" w:cstheme="majorBidi"/>
+          <w:sz w:val="24"/>
+          <w:szCs w:val="24"/>
+        </w:rPr>
+      </w:pPr>
+      <w:r>
+        <w:rPr>
+          <w:rFonts w:asciiTheme="majorBidi" w:hAnsiTheme="majorBidi" w:cstheme="majorBidi"/>
+          <w:sz w:val="24"/>
+          <w:szCs w:val="24"/>
+        </w:rPr>
         <w:t>Signature du Promoteur :</w:t>
       </w:r>
     </w:p>
     <w:p>
       <w:pPr>
         <w:spacing w:line="240" w:lineRule="auto"/>
-      </w:pPr>
-      <w:r>
+        <w:rPr>
+          <w:rFonts w:asciiTheme="majorBidi" w:hAnsiTheme="majorBidi" w:cstheme="majorBidi"/>
+          <w:sz w:val="24"/>
+          <w:szCs w:val="24"/>
+        </w:rPr>
+      </w:pPr>
+      <w:r>
+        <w:rPr>
+          <w:rFonts w:asciiTheme="majorBidi" w:hAnsiTheme="majorBidi" w:cstheme="majorBidi"/>
+          <w:sz w:val="24"/>
+          <w:szCs w:val="24"/>
+        </w:rPr>
         <w:t>{{PROMOTER_NAME}}</w:t>
       </w:r>
     </w:p>
     <w:p>
       <w:pPr>
         <w:spacing w:line="240" w:lineRule="auto"/>
-      </w:pPr>
-      <w:r>
-        <w:t>___________________________</w:t>
-      </w:r>
-    </w:p>
-    <w:p>
-      <w:pPr>
-        <w:spacing w:line="240" w:lineRule="auto"/>
-      </w:pPr>
-    </w:p>
-    <w:p>
-      <w:pPr>
-        <w:spacing w:line="240" w:lineRule="auto"/>
-      </w:pPr>
-      <w:r>
-        <w:t>Coordonnées de l’Agence :</w:t>
-      </w:r>
-    </w:p>
-    <w:p>
-      <w:pPr>
-        <w:spacing w:line="240" w:lineRule="auto"/>
-        <w:rPr>
-          <w:lang w:val="en-US"/>
-        </w:rPr>
-      </w:pPr>
-      <w:proofErr w:type="spellStart"/>
-      <w:proofErr w:type="gramStart"/>
-      <w:r>
-        <w:rPr>
-          <w:lang w:val="en-US"/>
-        </w:rPr>
-        <w:t>Téléphone</w:t>
-      </w:r>
-      <w:proofErr w:type="spellEnd"/>
-      <w:r>
-        <w:rPr>
-          <w:lang w:val="en-US"/>
-        </w:rPr>
-        <w:t xml:space="preserve"> :</w:t>
-      </w:r>
-      <w:proofErr w:type="gramEnd"/>
-      <w:r>
-        <w:rPr>
-          <w:lang w:val="en-US"/>
-        </w:rPr>
-        <w:t xml:space="preserve"> {{AGENCY_PHONE}}</w:t>
-      </w:r>
-    </w:p>
-    <w:p>
-      <w:pPr>
-        <w:spacing w:line="240" w:lineRule="auto"/>
         <w:rPr>
           <w:rStyle w:val="SubtleEmphasis"/>
+          <w:rFonts w:asciiTheme="majorBidi" w:hAnsiTheme="majorBidi" w:cstheme="majorBidi"/>
           <w:i w:val="0"/>
           <w:iCs w:val="0"/>
           <w:color w:val="auto"/>
-          <w:lang w:val="en-US"/>
-        </w:rPr>
-      </w:pPr>
-      <w:proofErr w:type="spellStart"/>
-      <w:proofErr w:type="gramStart"/>
-      <w:r>
-        <w:rPr>
-          <w:lang w:val="en-US"/>
-        </w:rPr>
-        <w:t>Adresse</w:t>
-      </w:r>
-      <w:proofErr w:type="spellEnd"/>
-      <w:r>
-        <w:rPr>
-          <w:lang w:val="en-US"/>
-        </w:rPr>
-        <w:t xml:space="preserve"> :</w:t>
-      </w:r>
-      <w:proofErr w:type="gramEnd"/>
-      <w:r>
-        <w:rPr>
-          <w:lang w:val="en-US"/>
-        </w:rPr>
-        <w:t xml:space="preserve"> {{AGENCY_ADDRESS}}Email : {{AGENCY_EMAIL}}</w:t>
+          <w:sz w:val="24"/>
+          <w:szCs w:val="24"/>
+        </w:rPr>
+      </w:pPr>
+      <w:r>
+        <w:rPr>
+          <w:rFonts w:asciiTheme="majorBidi" w:hAnsiTheme="majorBidi" w:cstheme="majorBidi"/>
+          <w:sz w:val="24"/>
+          <w:szCs w:val="24"/>
+        </w:rPr>
+        <w:t>___________________________</w:t>
       </w:r>
     </w:p>
     <w:sectPr>
       <w:headerReference w:type="default" r:id="rId6"/>
+      <w:footerReference w:type="default" r:id="rId7"/>
       <w:pgSz w:w="11906" w:h="16838"/>
       <w:pgMar w:top="1417" w:right="1417" w:bottom="1417" w:left="1417" w:header="708" w:footer="708" w:gutter="0"/>
       <w:cols w:space="708"/>
@@ -635,6 +964,62 @@
     </w:p>
   </w:endnote>
 </w:endnotes>
+</file>
+
+<file path=word/footer1.xml><?xml version="1.0" encoding="utf-8"?>
+<w:ftr xmlns:wpc="http://schemas.microsoft.com/office/word/2010/wordprocessingCanvas" xmlns:cx="http://schemas.microsoft.com/office/drawing/2014/chartex" xmlns:cx1="http://schemas.microsoft.com/office/drawing/2015/9/8/chartex" xmlns:cx2="http://schemas.microsoft.com/office/drawing/2015/10/21/chartex" xmlns:cx3="http://schemas.microsoft.com/office/drawing/2016/5/9/chartex" xmlns:cx4="http://schemas.microsoft.com/office/drawing/2016/5/10/chartex" xmlns:cx5="http://schemas.microsoft.com/office/drawing/2016/5/11/chartex" xmlns:cx6="http://schemas.microsoft.com/office/drawing/2016/5/12/chartex" xmlns:cx7="http://schemas.microsoft.com/office/drawing/2016/5/13/chartex" xmlns:cx8="http://schemas.microsoft.com/office/drawing/2016/5/14/chartex" xmlns:mc="http://schemas.openxmlformats.org/markup-compatibility/2006" xmlns:aink="http://schemas.microsoft.com/office/drawing/2016/ink" xmlns:am3d="http://schemas.microsoft.com/office/drawing/2017/model3d" xmlns:o="urn:schemas-microsoft-com:office:office" xmlns:oel="http://schemas.microsoft.com/office/2019/extlst" xmlns:r="http://schemas.openxmlformats.org/officeDocument/2006/relationships" xmlns:m="http://schemas.openxmlformats.org/officeDocument/2006/math" xmlns:v="urn:schemas-microsoft-com:vml" xmlns:wp14="http://schemas.microsoft.com/office/word/2010/wordprocessingDrawing" xmlns:wp="http://schemas.openxmlformats.org/drawingml/2006/wordprocessingDrawing" xmlns:w10="urn:schemas-microsoft-com:office:word" xmlns:w="http://schemas.openxmlformats.org/wordprocessingml/2006/main" xmlns:w14="http://schemas.microsoft.com/office/word/2010/wordml" xmlns:w15="http://schemas.microsoft.com/office/word/2012/wordml" xmlns:w16cex="http://schemas.microsoft.com/office/word/2018/wordml/cex" xmlns:w16cid="http://schemas.microsoft.com/office/word/2016/wordml/cid" xmlns:w16="http://schemas.microsoft.com/office/word/2018/wordml" xmlns:w16sdtdh="http://schemas.microsoft.com/office/word/2020/wordml/sdtdatahash" xmlns:w16se="http://schemas.microsoft.com/office/word/2015/wordml/symex" xmlns:wpg="http://schemas.microsoft.com/office/word/2010/wordprocessingGroup" xmlns:wpi="http://schemas.microsoft.com/office/word/2010/wordprocessingInk" xmlns:wne="http://schemas.microsoft.com/office/word/2006/wordml" xmlns:wps="http://schemas.microsoft.com/office/word/2010/wordprocessingShape" mc:Ignorable="w14 w15 w16se w16cid w16 w16cex w16sdtdh wp14">
+  <w:p>
+    <w:pPr>
+      <w:pStyle w:val="Footer"/>
+      <w:jc w:val="center"/>
+    </w:pPr>
+    <w:r>
+      <w:t>Tel : 0779 07 97 06/ 0792 11 65 96/ 0770 82 33 00</w:t>
+    </w:r>
+  </w:p>
+  <w:p>
+    <w:pPr>
+      <w:pStyle w:val="Footer"/>
+      <w:jc w:val="center"/>
+    </w:pPr>
+    <w:r>
+      <w:t xml:space="preserve">633 </w:t>
+    </w:r>
+    <w:proofErr w:type="gramStart"/>
+    <w:r>
+      <w:t>cité</w:t>
+    </w:r>
+    <w:proofErr w:type="gramEnd"/>
+    <w:r>
+      <w:t xml:space="preserve"> Horizon Bel Bâtiment 3A N°10 </w:t>
+    </w:r>
+    <w:proofErr w:type="spellStart"/>
+    <w:r>
+      <w:t>Bir</w:t>
+    </w:r>
+    <w:proofErr w:type="spellEnd"/>
+    <w:r>
+      <w:t xml:space="preserve"> el </w:t>
+    </w:r>
+    <w:proofErr w:type="spellStart"/>
+    <w:r>
+      <w:t>Djir</w:t>
+    </w:r>
+    <w:proofErr w:type="spellEnd"/>
+    <w:r>
+      <w:t xml:space="preserve"> Oran</w:t>
+    </w:r>
+  </w:p>
+  <w:p>
+    <w:pPr>
+      <w:pStyle w:val="Footer"/>
+      <w:jc w:val="center"/>
+    </w:pPr>
+    <w:r>
+      <w:t>contact@pyramideimmobilier.com</w:t>
+    </w:r>
+  </w:p>
+</w:ftr>
 </file>
 
 <file path=word/footnotes.xml><?xml version="1.0" encoding="utf-8"?>
@@ -673,15 +1058,15 @@
         <w:noProof/>
       </w:rPr>
       <w:drawing>
-        <wp:anchor distT="0" distB="0" distL="114300" distR="114300" simplePos="0" relativeHeight="251659264" behindDoc="0" locked="0" layoutInCell="1" allowOverlap="1" wp14:anchorId="0B3D0C3B" wp14:editId="17D2E7CF">
+        <wp:anchor distT="0" distB="0" distL="114300" distR="114300" simplePos="0" relativeHeight="251659264" behindDoc="0" locked="0" layoutInCell="1" allowOverlap="1" wp14:anchorId="0B3D0C3B" wp14:editId="06F78E5F">
           <wp:simplePos x="0" y="0"/>
           <wp:positionH relativeFrom="column">
-            <wp:posOffset>-189914</wp:posOffset>
+            <wp:posOffset>-440517</wp:posOffset>
           </wp:positionH>
           <wp:positionV relativeFrom="paragraph">
-            <wp:posOffset>-324192</wp:posOffset>
+            <wp:posOffset>-393017</wp:posOffset>
           </wp:positionV>
-          <wp:extent cx="3292884" cy="773723"/>
+          <wp:extent cx="4002258" cy="940403"/>
           <wp:effectExtent l="0" t="0" r="0" b="0"/>
           <wp:wrapNone/>
           <wp:docPr id="1759897493" name="Graphic 1"/>
@@ -713,7 +1098,7 @@
                 <pic:spPr>
                   <a:xfrm>
                     <a:off x="0" y="0"/>
-                    <a:ext cx="3292884" cy="773723"/>
+                    <a:ext cx="4002258" cy="940403"/>
                   </a:xfrm>
                   <a:prstGeom prst="rect">
                     <a:avLst/>

</xml_diff>